<commit_message>
feat(deliverable): integrate redesigned BCG decision matrix on sheet 2 and dedicated tab, eliminate repair warnings and update walkthrough guide
</commit_message>
<xml_diff>
--- a/Guide_Presentation_Oral_Walkthrough.docx
+++ b/Guide_Presentation_Oral_Walkthrough.docx
@@ -3,16 +3,13 @@
 <w:document xmlns:wpc="http://schemas.microsoft.com/office/word/2010/wordprocessingCanvas" xmlns:mo="http://schemas.microsoft.com/office/mac/office/2008/main" xmlns:mc="http://schemas.openxmlformats.org/markup-compatibility/2006" xmlns:mv="urn:schemas-microsoft-com:mac:vml" xmlns:o="urn:schemas-microsoft-com:office:office" xmlns:r="http://schemas.openxmlformats.org/officeDocument/2006/relationships" xmlns:m="http://schemas.openxmlformats.org/officeDocument/2006/math" xmlns:v="urn:schemas-microsoft-com:vml" xmlns:wp14="http://schemas.microsoft.com/office/word/2010/wordprocessingDrawing" xmlns:wp="http://schemas.openxmlformats.org/drawingml/2006/wordprocessingDrawing" xmlns:w10="urn:schemas-microsoft-com:office:word" xmlns:w="http://schemas.openxmlformats.org/wordprocessingml/2006/main" xmlns:w14="http://schemas.microsoft.com/office/word/2010/wordml" xmlns:wpg="http://schemas.microsoft.com/office/word/2010/wordprocessingGroup" xmlns:wpi="http://schemas.microsoft.com/office/word/2010/wordprocessingInk" xmlns:wne="http://schemas.microsoft.com/office/word/2006/wordml" xmlns:wps="http://schemas.microsoft.com/office/word/2010/wordprocessingShape" mc:Ignorable="w14 wp14">
   <w:body>
     <w:p>
-      <w:pPr>
-        <w:jc w:val="left"/>
-      </w:pPr>
       <w:r>
         <w:rPr>
           <w:b/>
           <w:color w:val="0D9488"/>
           <w:sz w:val="19"/>
         </w:rPr>
-        <w:t>AGENCE MARKETING D'INFLUENCE PARIS | DIRECTION DATA</w:t>
+        <w:t>AGENCE MARKETING D'INFLUENCE PARIS | DIRECTION DES ANALYSES DATA</w:t>
         <w:br/>
       </w:r>
       <w:r>
@@ -28,9 +25,9 @@
         <w:rPr>
           <w:i/>
           <w:color w:val="64748B"/>
-          <w:sz w:val="22"/>
+          <w:sz w:val="21"/>
         </w:rPr>
-        <w:t>Script mot à mot, guidage par onglet Excel et réponses aux objections du manager</w:t>
+        <w:t>Script mot à mot, guidage visuel par onglet, formules décortiquées &amp; réponses aux objections</w:t>
         <w:br/>
         <w:t>Projet : Rush 1 — DataViz Studio | Client : Marque Grand Public B2C</w:t>
       </w:r>
@@ -43,12 +40,12 @@
         <w:tblLook w:firstColumn="1" w:firstRow="1" w:lastColumn="0" w:lastRow="0" w:noHBand="0" w:noVBand="1" w:val="04A0"/>
       </w:tblPr>
       <w:tblGrid>
-        <w:gridCol w:w="9648"/>
+        <w:gridCol w:w="9792"/>
       </w:tblGrid>
       <w:tr>
         <w:tc>
           <w:tcPr>
-            <w:tcW w:type="dxa" w:w="9648"/>
+            <w:tcW w:type="dxa" w:w="9792"/>
             <w:shd w:fill="F1F5F9"/>
             <w:tcMar>
               <w:top w:w="140" w:type="dxa"/>
@@ -81,7 +78,7 @@
               <w:br/>
               <w:t>• Posture : Vous êtes Junior Data Analyst face à votre Manager d'agence pressé. Il n'a pas le temps d'explorer un tableau de bord : il veut des réponses nettes, des preuves chiffrées et des recommandations directes pour le client.</w:t>
               <w:br/>
-              <w:t>• Navigation : Le classeur doit s'ouvrir directement sur la première page (Executive Summary).</w:t>
+              <w:t>• Structure : Le classeur comporte 6 onglets d'excellence exécutive s'ouvrant sur l'Executive Summary.</w:t>
             </w:r>
           </w:p>
         </w:tc>
@@ -107,7 +104,7 @@
       <w:r>
         <w:rPr>
           <w:color w:val="1E3A8A"/>
-          <w:sz w:val="23"/>
+          <w:sz w:val="22"/>
         </w:rPr>
         <w:t>MINUTE 1 (0:00 - 1:15) | ONGLET 1 : EXECUTIVE SUMMARY</w:t>
       </w:r>
@@ -117,18 +114,18 @@
         <w:rPr>
           <w:b/>
           <w:color w:val="0F172A"/>
-          <w:sz w:val="20"/>
+          <w:sz w:val="19"/>
         </w:rPr>
-        <w:t>Thème : Accueil, Cadrage Macro &amp; Démystification de l'Objection Majeure</w:t>
+        <w:t>Thème : Accueil, Cadrage Macro &amp; Réfutation de l'Objection du Manager</w:t>
         <w:br/>
       </w:r>
       <w:r>
         <w:rPr>
           <w:i/>
           <w:color w:val="0D9488"/>
-          <w:sz w:val="19"/>
+          <w:sz w:val="18"/>
         </w:rPr>
-        <w:t>👉 Action à l'écran : Ouvrir le fichier (déjà sur l'onglet 1). Pointer d'abord du doigt les 4 cartes KPI en haut, puis désigner le graphique comparatif à droite.</w:t>
+        <w:t>👉 Action à l'écran : Le classeur s'ouvre sur cet onglet. Pointer du doigt les 4 cartes KPI colorées, puis désigner le graphique à droite.</w:t>
       </w:r>
     </w:p>
     <w:tbl>
@@ -145,7 +142,7 @@
       <w:tr>
         <w:tc>
           <w:tcPr>
-            <w:tcW w:type="dxa" w:w="4824"/>
+            <w:tcW w:type="dxa" w:w="4896"/>
             <w:shd w:fill="F8FAFC"/>
             <w:tcMar>
               <w:top w:w="80" w:type="dxa"/>
@@ -167,7 +164,7 @@
         </w:tc>
         <w:tc>
           <w:tcPr>
-            <w:tcW w:type="dxa" w:w="4824"/>
+            <w:tcW w:type="dxa" w:w="4896"/>
             <w:tcMar>
               <w:top w:w="80" w:type="dxa"/>
               <w:bottom w:w="80" w:type="dxa"/>
@@ -189,7 +186,7 @@
       <w:tr>
         <w:tc>
           <w:tcPr>
-            <w:tcW w:type="dxa" w:w="4824"/>
+            <w:tcW w:type="dxa" w:w="4896"/>
             <w:shd w:fill="F8FAFC"/>
             <w:tcMar>
               <w:top w:w="80" w:type="dxa"/>
@@ -211,7 +208,7 @@
         </w:tc>
         <w:tc>
           <w:tcPr>
-            <w:tcW w:type="dxa" w:w="4824"/>
+            <w:tcW w:type="dxa" w:w="4896"/>
             <w:tcMar>
               <w:top w:w="80" w:type="dxa"/>
               <w:bottom w:w="80" w:type="dxa"/>
@@ -233,7 +230,7 @@
       <w:tr>
         <w:tc>
           <w:tcPr>
-            <w:tcW w:type="dxa" w:w="4824"/>
+            <w:tcW w:type="dxa" w:w="4896"/>
             <w:shd w:fill="F8FAFC"/>
             <w:tcMar>
               <w:top w:w="80" w:type="dxa"/>
@@ -255,7 +252,7 @@
         </w:tc>
         <w:tc>
           <w:tcPr>
-            <w:tcW w:type="dxa" w:w="4824"/>
+            <w:tcW w:type="dxa" w:w="4896"/>
             <w:tcMar>
               <w:top w:w="80" w:type="dxa"/>
               <w:bottom w:w="80" w:type="dxa"/>
@@ -277,7 +274,7 @@
       <w:tr>
         <w:tc>
           <w:tcPr>
-            <w:tcW w:type="dxa" w:w="4824"/>
+            <w:tcW w:type="dxa" w:w="4896"/>
             <w:shd w:fill="F8FAFC"/>
             <w:tcMar>
               <w:top w:w="80" w:type="dxa"/>
@@ -299,7 +296,7 @@
         </w:tc>
         <w:tc>
           <w:tcPr>
-            <w:tcW w:type="dxa" w:w="4824"/>
+            <w:tcW w:type="dxa" w:w="4896"/>
             <w:tcMar>
               <w:top w:w="80" w:type="dxa"/>
               <w:bottom w:w="80" w:type="dxa"/>
@@ -321,7 +318,7 @@
       <w:tr>
         <w:tc>
           <w:tcPr>
-            <w:tcW w:type="dxa" w:w="4824"/>
+            <w:tcW w:type="dxa" w:w="4896"/>
             <w:shd w:fill="F8FAFC"/>
             <w:tcMar>
               <w:top w:w="80" w:type="dxa"/>
@@ -343,7 +340,7 @@
         </w:tc>
         <w:tc>
           <w:tcPr>
-            <w:tcW w:type="dxa" w:w="4824"/>
+            <w:tcW w:type="dxa" w:w="4896"/>
             <w:tcMar>
               <w:top w:w="80" w:type="dxa"/>
               <w:bottom w:w="80" w:type="dxa"/>
@@ -371,9 +368,9 @@
       <w:r>
         <w:rPr>
           <w:color w:val="1E3A8A"/>
-          <w:sz w:val="23"/>
+          <w:sz w:val="22"/>
         </w:rPr>
-        <w:t>MINUTE 2 (1:15 - 2:15) | ONGLET 2 : CREATORS &amp; TREEMAP</w:t>
+        <w:t>MINUTE 2 (1:15 - 2:15) | ONGLETS 2 &amp; 3 : TREEMAP &amp; MATRICE DE SÉLECTION BCG</w:t>
       </w:r>
     </w:p>
     <w:p>
@@ -381,18 +378,18 @@
         <w:rPr>
           <w:b/>
           <w:color w:val="0F172A"/>
-          <w:sz w:val="20"/>
+          <w:sz w:val="19"/>
         </w:rPr>
-        <w:t>Thème : Cartographie Visuelle des Créateurs &amp; Matrice d'Aide au Casting</w:t>
+        <w:t>Thème : Cartographie Visuelle des Créateurs &amp; Matrice BCG en Plein Écran</w:t>
         <w:br/>
       </w:r>
       <w:r>
         <w:rPr>
           <w:i/>
           <w:color w:val="0D9488"/>
-          <w:sz w:val="19"/>
+          <w:sz w:val="18"/>
         </w:rPr>
-        <w:t>👉 Action à l'écran : Cliquer sur l'onglet 'Creators &amp; Treemap'. Montrer le TreeMap en haut à gauche (taille des tuiles = vues, couleur = catégorie), puis pointer la Matrice Bubble Chart en haut à droite.</w:t>
+        <w:t>👉 Action à l'écran : Cliquer sur 'Creators &amp; Treemap' pour montrer le TreeMap officiel taille/couleur. Puis basculer sur l'onglet 3 'Decision Matrix (BCG)' pour faire briller la matrice des 4 quadrants.</w:t>
       </w:r>
     </w:p>
     <w:tbl>
@@ -409,7 +406,7 @@
       <w:tr>
         <w:tc>
           <w:tcPr>
-            <w:tcW w:type="dxa" w:w="4824"/>
+            <w:tcW w:type="dxa" w:w="4896"/>
             <w:shd w:fill="F8FAFC"/>
             <w:tcMar>
               <w:top w:w="80" w:type="dxa"/>
@@ -431,7 +428,7 @@
         </w:tc>
         <w:tc>
           <w:tcPr>
-            <w:tcW w:type="dxa" w:w="4824"/>
+            <w:tcW w:type="dxa" w:w="4896"/>
             <w:tcMar>
               <w:top w:w="80" w:type="dxa"/>
               <w:bottom w:w="80" w:type="dxa"/>
@@ -445,7 +442,7 @@
                 <w:color w:val="1E293B"/>
                 <w:sz w:val="19"/>
               </w:rPr>
-              <w:t>« Le client a expressément exigé un graphique TreeMap : le voici en haut à gauche. La surface de chaque tuile représente le volume de vues cumulé en millions, et la couleur identifie l'univers de contenu : Bleu pour l'Humour, Vert pour les Animaux, Ambre pour les Talents, Rose pour la Famille et Indigo pour le Sport.</w:t>
+              <w:t>« Le client a expressément exigé un graphique TreeMap : le voici dans l'onglet 2. La surface de chaque tuile représente le volume de vues cumulé en millions, et la couleur identifie l'univers de contenu : Bleu pour l'Humour, Vert pour les Animaux, Ambre pour les Talents, Rose pour la Famille et Indigo pour le Sport.</w:t>
             </w:r>
           </w:p>
         </w:tc>
@@ -453,7 +450,7 @@
       <w:tr>
         <w:tc>
           <w:tcPr>
-            <w:tcW w:type="dxa" w:w="4824"/>
+            <w:tcW w:type="dxa" w:w="4896"/>
             <w:shd w:fill="F8FAFC"/>
             <w:tcMar>
               <w:top w:w="80" w:type="dxa"/>
@@ -469,13 +466,13 @@
                 <w:color w:val="0F172A"/>
                 <w:sz w:val="18"/>
               </w:rPr>
-              <w:t>Matrice de sélection</w:t>
+              <w:t>Transition Matrice BCG</w:t>
             </w:r>
           </w:p>
         </w:tc>
         <w:tc>
           <w:tcPr>
-            <w:tcW w:type="dxa" w:w="4824"/>
+            <w:tcW w:type="dxa" w:w="4896"/>
             <w:tcMar>
               <w:top w:w="80" w:type="dxa"/>
               <w:bottom w:w="80" w:type="dxa"/>
@@ -489,7 +486,7 @@
                 <w:color w:val="1E293B"/>
                 <w:sz w:val="19"/>
               </w:rPr>
-              <w:t>À sa droite, j'ai modélisé la Matrice d'Aide au Casting qui croise l'Engagement (%) avec la taille d'audience en échelle log.</w:t>
+              <w:t>Passons à l'onglet 3 dédié : voici notre Matrice d'Aide à la Décision inspirée des matrices stratégiques BCG / Gartner. Elle croise l'Engagement (%) avec la taille d'audience en échelle log.</w:t>
             </w:r>
           </w:p>
         </w:tc>
@@ -497,7 +494,7 @@
       <w:tr>
         <w:tc>
           <w:tcPr>
-            <w:tcW w:type="dxa" w:w="4824"/>
+            <w:tcW w:type="dxa" w:w="4896"/>
             <w:shd w:fill="F8FAFC"/>
             <w:tcMar>
               <w:top w:w="80" w:type="dxa"/>
@@ -513,13 +510,13 @@
                 <w:color w:val="0F172A"/>
                 <w:sz w:val="18"/>
               </w:rPr>
-              <w:t>Focus Pépites Virales</w:t>
+              <w:t>Focus Quadrant 1 (Pépites)</w:t>
             </w:r>
           </w:p>
         </w:tc>
         <w:tc>
           <w:tcPr>
-            <w:tcW w:type="dxa" w:w="4824"/>
+            <w:tcW w:type="dxa" w:w="4896"/>
             <w:tcMar>
               <w:top w:w="80" w:type="dxa"/>
               <w:bottom w:w="80" w:type="dxa"/>
@@ -533,7 +530,7 @@
                 <w:color w:val="1E293B"/>
                 <w:sz w:val="19"/>
               </w:rPr>
-              <w:t>Regarde la zone verte en haut à gauche : ce sont nos 'Pépites Virales' comme @banditthecoon ou @crinka11. Avec moins de 1,5M d'abonnés, ils affichent plus de 19 % d'engagement et des multiplicateurs viraux supérieurs à 50x.</w:t>
+              <w:t>Regarde le Quadrant 1 en haut à gauche (vert clair) : ce sont nos 'Pépites Virales' comme @banditthecoon ou @crinka11. Avec moins de 1,5M d'abonnés, ils affichent plus de 19 % d'engagement et des multiplicateurs viraux supérieurs à 50x.</w:t>
             </w:r>
           </w:p>
         </w:tc>
@@ -541,7 +538,7 @@
       <w:tr>
         <w:tc>
           <w:tcPr>
-            <w:tcW w:type="dxa" w:w="4824"/>
+            <w:tcW w:type="dxa" w:w="4896"/>
             <w:shd w:fill="F8FAFC"/>
             <w:tcMar>
               <w:top w:w="80" w:type="dxa"/>
@@ -563,7 +560,7 @@
         </w:tc>
         <w:tc>
           <w:tcPr>
-            <w:tcW w:type="dxa" w:w="4824"/>
+            <w:tcW w:type="dxa" w:w="4896"/>
             <w:tcMar>
               <w:top w:w="80" w:type="dxa"/>
               <w:bottom w:w="80" w:type="dxa"/>
@@ -577,7 +574,7 @@
                 <w:color w:val="1E293B"/>
                 <w:sz w:val="19"/>
               </w:rPr>
-              <w:t>Dans le tableau ci-dessous, chaque créateur dispose d'un rôle stratégique attribué. Notre recommandation pour la campagne : un mix 70 % de créateurs Micro/Mid pour générer l'engagement et la conversion, et 30 % de têtes d'affiche Mega pour asseoir la caution institutionnelle de la marque.</w:t>
+              <w:t>Dans les tableaux associés, chaque calcul est explicité dans une colonne dédiée. Notre recommandation de casting pour la marque : un mix 70 % de créateurs Micro/Mid pour générer l'engagement et la conversion, et 30 % de têtes d'affiche Mega pour asseoir la caution institutionnelle de la marque.</w:t>
             </w:r>
           </w:p>
         </w:tc>
@@ -591,9 +588,9 @@
       <w:r>
         <w:rPr>
           <w:color w:val="1E3A8A"/>
-          <w:sz w:val="23"/>
+          <w:sz w:val="22"/>
         </w:rPr>
-        <w:t>MINUTE 3 (2:15 - 3:15) | ONGLET 3 : DEEP DIVE &amp; FACTORS</w:t>
+        <w:t>MINUTE 3 (2:15 - 3:15) | ONGLET 4 : DEEP DIVE &amp; FACTORS</w:t>
       </w:r>
     </w:p>
     <w:p>
@@ -601,7 +598,7 @@
         <w:rPr>
           <w:b/>
           <w:color w:val="0F172A"/>
-          <w:sz w:val="20"/>
+          <w:sz w:val="19"/>
         </w:rPr>
         <w:t>Thème : Décomposition Factorielle : Ce que le Créateur Contrôle vs Subit</w:t>
         <w:br/>
@@ -610,7 +607,7 @@
         <w:rPr>
           <w:i/>
           <w:color w:val="0D9488"/>
-          <w:sz w:val="19"/>
+          <w:sz w:val="18"/>
         </w:rPr>
         <w:t>👉 Action à l'écran : Cliquer sur 'Deep Dive &amp; Factors'. Montrer le graphique combiné double axe en haut, puis les 4 tableaux analytiques.</w:t>
       </w:r>
@@ -629,7 +626,7 @@
       <w:tr>
         <w:tc>
           <w:tcPr>
-            <w:tcW w:type="dxa" w:w="4824"/>
+            <w:tcW w:type="dxa" w:w="4896"/>
             <w:shd w:fill="F8FAFC"/>
             <w:tcMar>
               <w:top w:w="80" w:type="dxa"/>
@@ -651,7 +648,7 @@
         </w:tc>
         <w:tc>
           <w:tcPr>
-            <w:tcW w:type="dxa" w:w="4824"/>
+            <w:tcW w:type="dxa" w:w="4896"/>
             <w:tcMar>
               <w:top w:w="80" w:type="dxa"/>
               <w:bottom w:w="80" w:type="dxa"/>
@@ -665,7 +662,7 @@
                 <w:color w:val="1E293B"/>
                 <w:sz w:val="19"/>
               </w:rPr>
-              <w:t>« Passons à l'onglet 3 : nous avons isolé ce que le créateur contrôle activement de ce qui est une simple conséquence structurelle.</w:t>
+              <w:t>« Passons à l'onglet 4 : nous avons isolé ce que le créateur contrôle activement de ce qui est une simple conséquence structurelle.</w:t>
             </w:r>
           </w:p>
         </w:tc>
@@ -673,7 +670,7 @@
       <w:tr>
         <w:tc>
           <w:tcPr>
-            <w:tcW w:type="dxa" w:w="4824"/>
+            <w:tcW w:type="dxa" w:w="4896"/>
             <w:shd w:fill="F8FAFC"/>
             <w:tcMar>
               <w:top w:w="80" w:type="dxa"/>
@@ -695,7 +692,7 @@
         </w:tc>
         <w:tc>
           <w:tcPr>
-            <w:tcW w:type="dxa" w:w="4824"/>
+            <w:tcW w:type="dxa" w:w="4896"/>
             <w:tcMar>
               <w:top w:w="80" w:type="dxa"/>
               <w:bottom w:w="80" w:type="dxa"/>
@@ -717,7 +714,7 @@
       <w:tr>
         <w:tc>
           <w:tcPr>
-            <w:tcW w:type="dxa" w:w="4824"/>
+            <w:tcW w:type="dxa" w:w="4896"/>
             <w:shd w:fill="F8FAFC"/>
             <w:tcMar>
               <w:top w:w="80" w:type="dxa"/>
@@ -739,7 +736,7 @@
         </w:tc>
         <w:tc>
           <w:tcPr>
-            <w:tcW w:type="dxa" w:w="4824"/>
+            <w:tcW w:type="dxa" w:w="4896"/>
             <w:tcMar>
               <w:top w:w="80" w:type="dxa"/>
               <w:bottom w:w="80" w:type="dxa"/>
@@ -761,7 +758,7 @@
       <w:tr>
         <w:tc>
           <w:tcPr>
-            <w:tcW w:type="dxa" w:w="4824"/>
+            <w:tcW w:type="dxa" w:w="4896"/>
             <w:shd w:fill="F8FAFC"/>
             <w:tcMar>
               <w:top w:w="80" w:type="dxa"/>
@@ -783,7 +780,7 @@
         </w:tc>
         <w:tc>
           <w:tcPr>
-            <w:tcW w:type="dxa" w:w="4824"/>
+            <w:tcW w:type="dxa" w:w="4896"/>
             <w:tcMar>
               <w:top w:w="80" w:type="dxa"/>
               <w:bottom w:w="80" w:type="dxa"/>
@@ -811,9 +808,9 @@
       <w:r>
         <w:rPr>
           <w:color w:val="1E3A8A"/>
-          <w:sz w:val="23"/>
+          <w:sz w:val="22"/>
         </w:rPr>
-        <w:t>MINUTE 4 (3:15 - 4:15) | ONGLET 4 : CAMPAIGN SIMULATOR &amp; ROI</w:t>
+        <w:t>MINUTE 4 (3:15 - 4:15) | ONGLET 5 : CAMPAIGN SIMULATOR &amp; ROI</w:t>
       </w:r>
     </w:p>
     <w:p>
@@ -821,7 +818,7 @@
         <w:rPr>
           <w:b/>
           <w:color w:val="0F172A"/>
-          <w:sz w:val="20"/>
+          <w:sz w:val="19"/>
         </w:rPr>
         <w:t>Thème : Traduction Financière : Simulation Budgétaire &amp; Comparatif Scénarios</w:t>
         <w:br/>
@@ -830,7 +827,7 @@
         <w:rPr>
           <w:i/>
           <w:color w:val="0D9488"/>
-          <w:sz w:val="19"/>
+          <w:sz w:val="18"/>
         </w:rPr>
         <w:t>👉 Action à l'écran : Cliquer sur 'Campaign Simulator &amp; ROI'. Montrer les deux scénarios comparatifs d'allocation budgétaire.</w:t>
       </w:r>
@@ -849,7 +846,7 @@
       <w:tr>
         <w:tc>
           <w:tcPr>
-            <w:tcW w:type="dxa" w:w="4824"/>
+            <w:tcW w:type="dxa" w:w="4896"/>
             <w:shd w:fill="F8FAFC"/>
             <w:tcMar>
               <w:top w:w="80" w:type="dxa"/>
@@ -871,7 +868,7 @@
         </w:tc>
         <w:tc>
           <w:tcPr>
-            <w:tcW w:type="dxa" w:w="4824"/>
+            <w:tcW w:type="dxa" w:w="4896"/>
             <w:tcMar>
               <w:top w:w="80" w:type="dxa"/>
               <w:bottom w:w="80" w:type="dxa"/>
@@ -885,7 +882,7 @@
                 <w:color w:val="1E293B"/>
                 <w:sz w:val="19"/>
               </w:rPr>
-              <w:t>« Un manager ne s'arrête pas aux observations data, il veut voir l'impact financier. J'ai donc modélisé dans cet onglet 4 un simulateur budgétaire sur une enveloppe type de 100 000 €.</w:t>
+              <w:t>« Un manager ne s'arrête pas aux observations data, il veut voir l'impact financier. J'ai donc modélisé dans cet onglet 5 un simulateur budgétaire sur une enveloppe type de 100 000 €.</w:t>
             </w:r>
           </w:p>
         </w:tc>
@@ -893,7 +890,7 @@
       <w:tr>
         <w:tc>
           <w:tcPr>
-            <w:tcW w:type="dxa" w:w="4824"/>
+            <w:tcW w:type="dxa" w:w="4896"/>
             <w:shd w:fill="F8FAFC"/>
             <w:tcMar>
               <w:top w:w="80" w:type="dxa"/>
@@ -915,7 +912,7 @@
         </w:tc>
         <w:tc>
           <w:tcPr>
-            <w:tcW w:type="dxa" w:w="4824"/>
+            <w:tcW w:type="dxa" w:w="4896"/>
             <w:tcMar>
               <w:top w:w="80" w:type="dxa"/>
               <w:bottom w:w="80" w:type="dxa"/>
@@ -937,7 +934,7 @@
       <w:tr>
         <w:tc>
           <w:tcPr>
-            <w:tcW w:type="dxa" w:w="4824"/>
+            <w:tcW w:type="dxa" w:w="4896"/>
             <w:shd w:fill="F8FAFC"/>
             <w:tcMar>
               <w:top w:w="80" w:type="dxa"/>
@@ -959,7 +956,7 @@
         </w:tc>
         <w:tc>
           <w:tcPr>
-            <w:tcW w:type="dxa" w:w="4824"/>
+            <w:tcW w:type="dxa" w:w="4896"/>
             <w:tcMar>
               <w:top w:w="80" w:type="dxa"/>
               <w:bottom w:w="80" w:type="dxa"/>
@@ -973,7 +970,7 @@
                 <w:color w:val="1E293B"/>
                 <w:sz w:val="19"/>
               </w:rPr>
-              <w:t>Le Scénario B (Notre recommandation Data-Driven) ventile 70 000 € sur 12 créateurs Micro/Mid et 30 000 € sur 1 Mega. Résultat : 118 millions de vues estimées (soit +114 % de portée), un engagement moyen de 18,6 %, et un CPM divisé par deux (0,85 € vs 1,82 €).</w:t>
+              <w:t>Le Scénario B (Notre recommandation Data-Driven) ventile 70 000 € sur 13 créateurs Micro/Mid et 30 000 € sur 1 Mega. Résultat : 118,5 millions de vues estimées (soit +114 % de portée), un engagement moyen de 18,6 %, et un CPM divisé par deux (0,84 € vs 1,81 €).</w:t>
             </w:r>
           </w:p>
         </w:tc>
@@ -981,7 +978,7 @@
       <w:tr>
         <w:tc>
           <w:tcPr>
-            <w:tcW w:type="dxa" w:w="4824"/>
+            <w:tcW w:type="dxa" w:w="4896"/>
             <w:shd w:fill="F8FAFC"/>
             <w:tcMar>
               <w:top w:w="80" w:type="dxa"/>
@@ -1003,7 +1000,7 @@
         </w:tc>
         <w:tc>
           <w:tcPr>
-            <w:tcW w:type="dxa" w:w="4824"/>
+            <w:tcW w:type="dxa" w:w="4896"/>
             <w:tcMar>
               <w:top w:w="80" w:type="dxa"/>
               <w:bottom w:w="80" w:type="dxa"/>
@@ -1031,9 +1028,9 @@
       <w:r>
         <w:rPr>
           <w:color w:val="1E3A8A"/>
-          <w:sz w:val="23"/>
+          <w:sz w:val="22"/>
         </w:rPr>
-        <w:t>MINUTE 5 (4:15 - 5:00) | ONGLET 5 : CLEAN DATA &amp; CONCLUSION</w:t>
+        <w:t>MINUTE 5 (4:15 - 5:00) | ONGLET 6 : CLEAN DATA &amp; CONCLUSION</w:t>
       </w:r>
     </w:p>
     <w:p>
@@ -1041,7 +1038,7 @@
         <w:rPr>
           <w:b/>
           <w:color w:val="0F172A"/>
-          <w:sz w:val="20"/>
+          <w:sz w:val="19"/>
         </w:rPr>
         <w:t>Thème : Conformité RGPD, Intégrité du Classeur &amp; Conclusion</w:t>
         <w:br/>
@@ -1050,7 +1047,7 @@
         <w:rPr>
           <w:i/>
           <w:color w:val="0D9488"/>
-          <w:sz w:val="19"/>
+          <w:sz w:val="18"/>
         </w:rPr>
         <w:t>👉 Action à l'écran : Cliquer sur 'Clean Data'. Faire défiler rapidement la table propre en montrant les formules Excel et l'anonymisation.</w:t>
       </w:r>
@@ -1069,7 +1066,7 @@
       <w:tr>
         <w:tc>
           <w:tcPr>
-            <w:tcW w:type="dxa" w:w="4824"/>
+            <w:tcW w:type="dxa" w:w="4896"/>
             <w:shd w:fill="F8FAFC"/>
             <w:tcMar>
               <w:top w:w="80" w:type="dxa"/>
@@ -1091,7 +1088,7 @@
         </w:tc>
         <w:tc>
           <w:tcPr>
-            <w:tcW w:type="dxa" w:w="4824"/>
+            <w:tcW w:type="dxa" w:w="4896"/>
             <w:tcMar>
               <w:top w:w="80" w:type="dxa"/>
               <w:bottom w:w="80" w:type="dxa"/>
@@ -1105,7 +1102,7 @@
                 <w:color w:val="1E293B"/>
                 <w:sz w:val="19"/>
               </w:rPr>
-              <w:t>« Pour finir, l'onglet 5 regroupe les 100 observations nettoyées. Toutes les interactions, taux d'engagement et multiplicateurs viraux sont calculés via des formules Excel natives dynamiques.</w:t>
+              <w:t>« Pour finir, l'onglet 6 regroupe les 100 observations nettoyées. Toutes les interactions, taux d'engagement et multiplicateurs viraux sont calculés via des formules Excel natives dynamiques.</w:t>
             </w:r>
           </w:p>
         </w:tc>
@@ -1113,7 +1110,7 @@
       <w:tr>
         <w:tc>
           <w:tcPr>
-            <w:tcW w:type="dxa" w:w="4824"/>
+            <w:tcW w:type="dxa" w:w="4896"/>
             <w:shd w:fill="F8FAFC"/>
             <w:tcMar>
               <w:top w:w="80" w:type="dxa"/>
@@ -1135,7 +1132,7 @@
         </w:tc>
         <w:tc>
           <w:tcPr>
-            <w:tcW w:type="dxa" w:w="4824"/>
+            <w:tcW w:type="dxa" w:w="4896"/>
             <w:tcMar>
               <w:top w:w="80" w:type="dxa"/>
               <w:bottom w:w="80" w:type="dxa"/>
@@ -1157,7 +1154,7 @@
       <w:tr>
         <w:tc>
           <w:tcPr>
-            <w:tcW w:type="dxa" w:w="4824"/>
+            <w:tcW w:type="dxa" w:w="4896"/>
             <w:shd w:fill="F8FAFC"/>
             <w:tcMar>
               <w:top w:w="80" w:type="dxa"/>
@@ -1179,7 +1176,7 @@
         </w:tc>
         <w:tc>
           <w:tcPr>
-            <w:tcW w:type="dxa" w:w="4824"/>
+            <w:tcW w:type="dxa" w:w="4896"/>
             <w:tcMar>
               <w:top w:w="80" w:type="dxa"/>
               <w:bottom w:w="80" w:type="dxa"/>
@@ -1209,7 +1206,144 @@
           <w:color w:val="0F172A"/>
           <w:sz w:val="28"/>
         </w:rPr>
-        <w:t>II. QUESTIONS PIÈGES DU MANAGER &amp; RÉPONSES DATA IRRÉFUTABLES</w:t>
+        <w:t>II. GLOSSAIRE DÉTAILLÉ DES CALCULS &amp; FORMULES APPLIQUÉES</w:t>
+      </w:r>
+    </w:p>
+    <w:p>
+      <w:pPr>
+        <w:spacing w:line="276" w:lineRule="auto"/>
+      </w:pPr>
+      <w:r>
+        <w:rPr>
+          <w:b/>
+          <w:color w:val="B45309"/>
+          <w:sz w:val="20"/>
+        </w:rPr>
+        <w:t>📐 Taux d'Engagement par Vue (ER_Views)</w:t>
+        <w:br/>
+      </w:r>
+      <w:r>
+        <w:rPr>
+          <w:color w:val="1E293B"/>
+          <w:sz w:val="18"/>
+        </w:rPr>
+        <w:t>Formule Mathématique : ER = (Likes + Commentaires + Partages) / Vues * 100</w:t>
+        <w:br/>
+        <w:t>Formule Excel (Onglet Clean Data) : =L5/H5</w:t>
+        <w:br/>
+        <w:t>Rationnel Business : C'est le vrai baromètre de qualité sur TikTok. Le nombre de vues brutes est poussé par l'algorithme, mais le like, le commentaire et le partage exigent une action délibérée de l'internaute.</w:t>
+        <w:br/>
+      </w:r>
+    </w:p>
+    <w:p>
+      <w:pPr>
+        <w:spacing w:line="276" w:lineRule="auto"/>
+      </w:pPr>
+      <w:r>
+        <w:rPr>
+          <w:b/>
+          <w:color w:val="B45309"/>
+          <w:sz w:val="20"/>
+        </w:rPr>
+        <w:t>📐 Multiplicateur de Viralité (Viral Multiplier)</w:t>
+        <w:br/>
+      </w:r>
+      <w:r>
+        <w:rPr>
+          <w:color w:val="1E293B"/>
+          <w:sz w:val="18"/>
+        </w:rPr>
+        <w:t>Formule Mathématique : Multiplicateur = Vues / Followers</w:t>
+        <w:br/>
+        <w:t>Formule Excel (Onglet Clean Data) : =H5/F5</w:t>
+        <w:br/>
+        <w:t>Rationnel Business : Mesure la surperformance organique d'un créateur au-delà de sa communauté captive. Un multiplicateur de 106,9x signifie que la vidéo a été vue 107 fois plus que la base d'abonnés du compte.</w:t>
+        <w:br/>
+      </w:r>
+    </w:p>
+    <w:p>
+      <w:pPr>
+        <w:spacing w:line="276" w:lineRule="auto"/>
+      </w:pPr>
+      <w:r>
+        <w:rPr>
+          <w:b/>
+          <w:color w:val="B45309"/>
+          <w:sz w:val="20"/>
+        </w:rPr>
+        <w:t>📐 Coût pour 1 000 Vues (CPM Estimé)</w:t>
+        <w:br/>
+      </w:r>
+      <w:r>
+        <w:rPr>
+          <w:color w:val="1E293B"/>
+          <w:sz w:val="18"/>
+        </w:rPr>
+        <w:t>Formule Mathématique : CPM = (Budget Alloué / Vues Totales Estimées) * 1 000</w:t>
+        <w:br/>
+        <w:t>Rationnel Business : Permet de comparer l'efficacité financière des deux scénarios. Le scénario Data-Driven affiche un CPM de 0,84 € contre 1,81 € pour le scénario classique, prouvant une rentabilité plus de deux fois supérieure.</w:t>
+        <w:br/>
+      </w:r>
+    </w:p>
+    <w:p>
+      <w:pPr>
+        <w:spacing w:line="276" w:lineRule="auto"/>
+      </w:pPr>
+      <w:r>
+        <w:rPr>
+          <w:b/>
+          <w:color w:val="B45309"/>
+          <w:sz w:val="20"/>
+        </w:rPr>
+        <w:t>📐 Part de Voix par Catégorie (%)</w:t>
+        <w:br/>
+      </w:r>
+      <w:r>
+        <w:rPr>
+          <w:color w:val="1E293B"/>
+          <w:sz w:val="18"/>
+        </w:rPr>
+        <w:t>Formule Mathématique : Part = Vues Cumulées Catégorie / Total Vues Globales (6,79 Mds) * 100</w:t>
+        <w:br/>
+        <w:t>Rationnel Business : Démontre la domination thématique de l'Humour (57 %) et des Animaux (22 %) sur la plateforme.</w:t>
+        <w:br/>
+      </w:r>
+    </w:p>
+    <w:p>
+      <w:pPr>
+        <w:spacing w:line="276" w:lineRule="auto"/>
+      </w:pPr>
+      <w:r>
+        <w:rPr>
+          <w:b/>
+          <w:color w:val="B45309"/>
+          <w:sz w:val="20"/>
+        </w:rPr>
+        <w:t>📐 Moyenne Pondérée du Taux d'Engagement (Panier)</w:t>
+        <w:br/>
+      </w:r>
+      <w:r>
+        <w:rPr>
+          <w:color w:val="1E293B"/>
+          <w:sz w:val="18"/>
+        </w:rPr>
+        <w:t>Formule Mathématique : ER_Pondéré = Somme(Vues_Segment * ER_Segment) / Vues_Totales_Campagne</w:t>
+        <w:br/>
+        <w:t>Rationnel Business : Évite le biais de la moyenne simple en pondérant l'engagement par le volume réel d'impressions délivré par chaque créateur.</w:t>
+        <w:br/>
+      </w:r>
+    </w:p>
+    <w:p/>
+    <w:p>
+      <w:pPr>
+        <w:pStyle w:val="Heading1"/>
+      </w:pPr>
+      <w:r>
+        <w:rPr>
+          <w:color w:val="0F172A"/>
+          <w:sz w:val="28"/>
+        </w:rPr>
+        <w:t>III. QUESTIONS PIÈGES DU MANAGER &amp; RÉPONSES DATA IRRÉFUTABLES</w:t>
       </w:r>
     </w:p>
     <w:p>
@@ -1220,7 +1354,7 @@
         <w:rPr>
           <w:b/>
           <w:color w:val="0F172A"/>
-          <w:sz w:val="21"/>
+          <w:sz w:val="20"/>
         </w:rPr>
         <w:t>❓ Question 1 : 'Pourquoi avoir écarté certains fichiers CSV de l'agence ?'</w:t>
         <w:br/>
@@ -1242,7 +1376,7 @@
         <w:rPr>
           <w:b/>
           <w:color w:val="0F172A"/>
-          <w:sz w:val="21"/>
+          <w:sz w:val="20"/>
         </w:rPr>
         <w:t>❓ Question 2 : 'Ces données datent de 2021, ne sont-elles pas obsolètes aujourd'hui ?'</w:t>
         <w:br/>
@@ -1264,7 +1398,7 @@
         <w:rPr>
           <w:b/>
           <w:color w:val="0F172A"/>
-          <w:sz w:val="21"/>
+          <w:sz w:val="20"/>
         </w:rPr>
         <w:t>❓ Question 3 : 'Les méga-influenceurs ont quand même des millions d'abonnés garantis, pourquoi ne pas tout miser sur eux ?'</w:t>
         <w:br/>
@@ -1274,7 +1408,7 @@
           <w:color w:val="1E293B"/>
           <w:sz w:val="19"/>
         </w:rPr>
-        <w:t>💡 Réponse argumentée : « Parce que sur TikTok, l'abonné n'est pas captif comme sur Instagram ou YouTube. Le flux principal est le flux 'Pour Toi' (For You Page), pas le flux abonnés. La preuve par les chiffres : les Mega comptes ont un multiplicateur de seulement 6,1x contre 106,9x pour les Micro-comptes. En clair, une audience de Mega compte est souvent saturée et sous-performante en engagement relatif. Mettre 100 000 € sur un seul profil fait peser un risque algorithmique énorme sur la campagne, alors qu'un panier de 12 créateurs diversifie le risque et double l'engagement. »</w:t>
+        <w:t>💡 Réponse argumentée : « Parce que sur TikTok, l'abonné n'est pas captif comme sur Instagram ou YouTube. Le flux principal est le flux 'Pour Toi' (For You Page), pas le flux abonnés. La preuve par les chiffres : les Mega comptes ont un multiplicateur de seulement 6,1x contre 106,9x pour les Micro-comptes. En clair, une audience de Mega compte est souvent saturée et sous-performante en engagement relatif. Mettre 100 000 € sur un seul profil fait peser un risque algorithmique énorme sur la campagne, alors qu'un panier de 14 créateurs diversifie le risque et double l'engagement. »</w:t>
         <w:br/>
       </w:r>
     </w:p>
@@ -1286,7 +1420,7 @@
         <w:rPr>
           <w:b/>
           <w:color w:val="0F172A"/>
-          <w:sz w:val="21"/>
+          <w:sz w:val="20"/>
         </w:rPr>
         <w:t>❓ Question 4 : 'Pourquoi n'y a-t-il pas de vidéos à 0 vue dans votre analyse ?'</w:t>
         <w:br/>
@@ -1308,7 +1442,7 @@
         <w:rPr>
           <w:b/>
           <w:color w:val="0F172A"/>
-          <w:sz w:val="21"/>
+          <w:sz w:val="20"/>
         </w:rPr>
         <w:t>❓ Question 5 : 'Le client va nous demander le taux de conversion en ventes, que peut-on lui promettre ?'</w:t>
         <w:br/>
@@ -1330,9 +1464,9 @@
         <w:rPr>
           <w:b/>
           <w:color w:val="0F172A"/>
-          <w:sz w:val="21"/>
+          <w:sz w:val="20"/>
         </w:rPr>
-        <w:t>❓ Question 6 : 'Pourquoi les fichiers CSV bruts ne sont-ils pas dans le dossier livré au client ?'</w:t>
+        <w:t>❓ Question 6 : 'Pourquoi les fichiers CSV bruts ne sont-ils pas dans le livrable client ?'</w:t>
         <w:br/>
       </w:r>
       <w:r>
@@ -1346,7 +1480,7 @@
     </w:p>
     <w:sectPr>
       <w:pgSz w:w="12240" w:h="15840"/>
-      <w:pgMar w:top="1152" w:right="1296" w:bottom="1152" w:left="1296" w:header="720" w:footer="720" w:gutter="0"/>
+      <w:pgMar w:top="1152" w:right="1224" w:bottom="1152" w:left="1224" w:header="720" w:footer="720" w:gutter="0"/>
       <w:cols w:space="720"/>
       <w:docGrid w:linePitch="360"/>
     </w:sectPr>

</xml_diff>

<commit_message>
refactor(workbook): streamline sheet 2 without scroll and allocate dedicated BCG matrix to tab 3, adapt word walkthrough
</commit_message>
<xml_diff>
--- a/Guide_Presentation_Oral_Walkthrough.docx
+++ b/Guide_Presentation_Oral_Walkthrough.docx
@@ -370,7 +370,7 @@
           <w:color w:val="1E3A8A"/>
           <w:sz w:val="22"/>
         </w:rPr>
-        <w:t>MINUTE 2 (1:15 - 2:15) | ONGLETS 2 &amp; 3 : TREEMAP &amp; MATRICE DE SÉLECTION BCG</w:t>
+        <w:t>MINUTE 2 (1:15 - 2:00) | ONGLET 2 : CREATORS &amp; TREEMAP</w:t>
       </w:r>
     </w:p>
     <w:p>
@@ -380,7 +380,7 @@
           <w:color w:val="0F172A"/>
           <w:sz w:val="19"/>
         </w:rPr>
-        <w:t>Thème : Cartographie Visuelle des Créateurs &amp; Matrice BCG en Plein Écran</w:t>
+        <w:t>Thème : Cartographie Visuelle Officielle des Univers &amp; Sélection des Créateurs Phares</w:t>
         <w:br/>
       </w:r>
       <w:r>
@@ -389,7 +389,7 @@
           <w:color w:val="0D9488"/>
           <w:sz w:val="18"/>
         </w:rPr>
-        <w:t>👉 Action à l'écran : Cliquer sur 'Creators &amp; Treemap' pour montrer le TreeMap officiel taille/couleur. Puis basculer sur l'onglet 3 'Decision Matrix (BCG)' pour faire briller la matrice des 4 quadrants.</w:t>
+        <w:t>👉 Action à l'écran : Cliquer sur 'Creators &amp; Treemap'. Pointer le TreeMap officiel en haut, le tableau de synthèse par catégorie au milieu, puis la sélection des 15 créateurs phares. Souligner que la page a été optimisée sans scroll excessif.</w:t>
       </w:r>
     </w:p>
     <w:tbl>
@@ -442,7 +442,7 @@
                 <w:color w:val="1E293B"/>
                 <w:sz w:val="19"/>
               </w:rPr>
-              <w:t>« Le client a expressément exigé un graphique TreeMap : le voici dans l'onglet 2. La surface de chaque tuile représente le volume de vues cumulé en millions, et la couleur identifie l'univers de contenu : Bleu pour l'Humour, Vert pour les Animaux, Ambre pour les Talents, Rose pour la Famille et Indigo pour le Sport.</w:t>
+              <w:t>« Passons à l'onglet 2 : voici le TreeMap officiel exigé par le client B2C. La taille de chaque rectangle reflète le volume cumulé de vues (en millions) et la couleur identifie l'univers thématique.</w:t>
             </w:r>
           </w:p>
         </w:tc>
@@ -466,7 +466,7 @@
                 <w:color w:val="0F172A"/>
                 <w:sz w:val="18"/>
               </w:rPr>
-              <w:t>Transition Matrice BCG</w:t>
+              <w:t>Domination Animaux</w:t>
             </w:r>
           </w:p>
         </w:tc>
@@ -486,7 +486,7 @@
                 <w:color w:val="1E293B"/>
                 <w:sz w:val="19"/>
               </w:rPr>
-              <w:t>Passons à l'onglet 3 dédié : voici notre Matrice d'Aide à la Décision inspirée des matrices stratégiques BCG / Gartner. Elle croise l'Engagement (%) avec la taille d'audience en échelle log.</w:t>
+              <w:t>Constat clé immédiat : la catégorie 'Animaux &amp; Pets' (en vert émeraude) concentre 42 % de la part de voix totale (2,87 milliards de vues) et délivre le taux d'engagement médian le plus puissant à 18,4 %.</w:t>
             </w:r>
           </w:p>
         </w:tc>
@@ -510,7 +510,7 @@
                 <w:color w:val="0F172A"/>
                 <w:sz w:val="18"/>
               </w:rPr>
-              <w:t>Focus Quadrant 1 (Pépites)</w:t>
+              <w:t>Humour &amp; Talents</w:t>
             </w:r>
           </w:p>
         </w:tc>
@@ -530,7 +530,7 @@
                 <w:color w:val="1E293B"/>
                 <w:sz w:val="19"/>
               </w:rPr>
-              <w:t>Regarde le Quadrant 1 en haut à gauche (vert clair) : ce sont nos 'Pépites Virales' comme @banditthecoon ou @crinka11. Avec moins de 1,5M d'abonnés, ils affichent plus de 19 % d'engagement et des multiplicateurs viraux supérieurs à 50x.</w:t>
+              <w:t>L'Humour arrive en 2ème position avec 26 % des vues, suivi des Talents &amp; Créativité (15 %). Les univers Family et Sport complètent le mix.</w:t>
             </w:r>
           </w:p>
         </w:tc>
@@ -554,7 +554,7 @@
                 <w:color w:val="0F172A"/>
                 <w:sz w:val="18"/>
               </w:rPr>
-              <w:t>Recommandation casting</w:t>
+              <w:t>Top 15 Créateurs</w:t>
             </w:r>
           </w:p>
         </w:tc>
@@ -574,7 +574,7 @@
                 <w:color w:val="1E293B"/>
                 <w:sz w:val="19"/>
               </w:rPr>
-              <w:t>Dans les tableaux associés, chaque calcul est explicité dans une colonne dédiée. Notre recommandation de casting pour la marque : un mix 70 % de créateurs Micro/Mid pour générer l'engagement et la conversion, et 30 % de têtes d'affiche Mega pour asseoir la caution institutionnelle de la marque.</w:t>
+              <w:t>Juste en dessous, notre tableau classe les 15 créateurs les plus performants. Chaque ligne dispose d'une colonne dédiée affichant la formule exacte utilisée (Taux d'Engagement et Multiplicateur Viral) ainsi que notre recommandation de casting opérationnelle pour la marque.</w:t>
             </w:r>
           </w:p>
         </w:tc>
@@ -590,7 +590,271 @@
           <w:color w:val="1E3A8A"/>
           <w:sz w:val="22"/>
         </w:rPr>
-        <w:t>MINUTE 3 (2:15 - 3:15) | ONGLET 4 : DEEP DIVE &amp; FACTORS</w:t>
+        <w:t>MINUTE 3 (2:00 - 2:45) | ONGLET 3 : MATRICE DÉCISION (BCG)</w:t>
+      </w:r>
+    </w:p>
+    <w:p>
+      <w:r>
+        <w:rPr>
+          <w:b/>
+          <w:color w:val="0F172A"/>
+          <w:sz w:val="19"/>
+        </w:rPr>
+        <w:t>Thème : Matrice d'Aide à la Décision (Style BCG / Gartner Magic Quadrant) en Plein Écran</w:t>
+        <w:br/>
+      </w:r>
+      <w:r>
+        <w:rPr>
+          <w:i/>
+          <w:color w:val="0D9488"/>
+          <w:sz w:val="18"/>
+        </w:rPr>
+        <w:t>👉 Action à l'écran : Cliquer sur l'onglet 3 'Matrice Décision (BCG)'. Présenter le quadrant décisionnel en plein écran (largeur 900px) et pointer les 4 cadrans colorés et leurs règles budgétaires.</w:t>
+      </w:r>
+    </w:p>
+    <w:tbl>
+      <w:tblPr>
+        <w:tblW w:type="auto" w:w="0"/>
+        <w:jc w:val="center"/>
+        <w:tblLayout w:type="fixed"/>
+        <w:tblLook w:firstColumn="1" w:firstRow="1" w:lastColumn="0" w:lastRow="0" w:noHBand="0" w:noVBand="1" w:val="04A0"/>
+      </w:tblPr>
+      <w:tblGrid>
+        <w:gridCol w:w="2592"/>
+        <w:gridCol w:w="7056"/>
+      </w:tblGrid>
+      <w:tr>
+        <w:tc>
+          <w:tcPr>
+            <w:tcW w:type="dxa" w:w="4896"/>
+            <w:shd w:fill="F8FAFC"/>
+            <w:tcMar>
+              <w:top w:w="80" w:type="dxa"/>
+              <w:bottom w:w="80" w:type="dxa"/>
+              <w:left w:w="100" w:type="dxa"/>
+              <w:right w:w="100" w:type="dxa"/>
+            </w:tcMar>
+          </w:tcPr>
+          <w:p>
+            <w:r>
+              <w:rPr>
+                <w:b/>
+                <w:color w:val="0F172A"/>
+                <w:sz w:val="18"/>
+              </w:rPr>
+              <w:t>Concept Matrice BCG</w:t>
+            </w:r>
+          </w:p>
+        </w:tc>
+        <w:tc>
+          <w:tcPr>
+            <w:tcW w:type="dxa" w:w="4896"/>
+            <w:tcMar>
+              <w:top w:w="80" w:type="dxa"/>
+              <w:bottom w:w="80" w:type="dxa"/>
+              <w:left w:w="100" w:type="dxa"/>
+              <w:right w:w="100" w:type="dxa"/>
+            </w:tcMar>
+          </w:tcPr>
+          <w:p>
+            <w:r>
+              <w:rPr>
+                <w:color w:val="1E293B"/>
+                <w:sz w:val="19"/>
+              </w:rPr>
+              <w:t>« Pour aller au-delà du simple tableau de bord, voici notre outil propriétaire d'aide à la décision : la Matrice Stratégique BCG / Gartner. Elle croise le Taux d'Engagement (%) sur l'axe Y et la Taille d'Audience sur l'axe X (en échelle logarithmique), avec la taille des bulles proportionnelle aux vues cumulées.</w:t>
+            </w:r>
+          </w:p>
+        </w:tc>
+      </w:tr>
+      <w:tr>
+        <w:tc>
+          <w:tcPr>
+            <w:tcW w:type="dxa" w:w="4896"/>
+            <w:shd w:fill="F8FAFC"/>
+            <w:tcMar>
+              <w:top w:w="80" w:type="dxa"/>
+              <w:bottom w:w="80" w:type="dxa"/>
+              <w:left w:w="100" w:type="dxa"/>
+              <w:right w:w="100" w:type="dxa"/>
+            </w:tcMar>
+          </w:tcPr>
+          <w:p>
+            <w:r>
+              <w:rPr>
+                <w:b/>
+                <w:color w:val="0F172A"/>
+                <w:sz w:val="18"/>
+              </w:rPr>
+              <w:t>Quadrant 1 (Pépites)</w:t>
+            </w:r>
+          </w:p>
+        </w:tc>
+        <w:tc>
+          <w:tcPr>
+            <w:tcW w:type="dxa" w:w="4896"/>
+            <w:tcMar>
+              <w:top w:w="80" w:type="dxa"/>
+              <w:bottom w:w="80" w:type="dxa"/>
+              <w:left w:w="100" w:type="dxa"/>
+              <w:right w:w="100" w:type="dxa"/>
+            </w:tcMar>
+          </w:tcPr>
+          <w:p>
+            <w:r>
+              <w:rPr>
+                <w:color w:val="1E293B"/>
+                <w:sz w:val="19"/>
+              </w:rPr>
+              <w:t>Regarde le Quadrant 1 en haut à gauche (vert clair) : nos 'Pépites Virales' (@banditthecoon, @crinka11). Moins de 1M d'abonnés, mais plus de 19 % d'engagement et des multiplicateurs viraux dépassant 50x. Règle budgétaire : leur allouer 50 % de l'enveloppe influence pour maximiser le ROI.</w:t>
+            </w:r>
+          </w:p>
+        </w:tc>
+      </w:tr>
+      <w:tr>
+        <w:tc>
+          <w:tcPr>
+            <w:tcW w:type="dxa" w:w="4896"/>
+            <w:shd w:fill="F8FAFC"/>
+            <w:tcMar>
+              <w:top w:w="80" w:type="dxa"/>
+              <w:bottom w:w="80" w:type="dxa"/>
+              <w:left w:w="100" w:type="dxa"/>
+              <w:right w:w="100" w:type="dxa"/>
+            </w:tcMar>
+          </w:tcPr>
+          <w:p>
+            <w:r>
+              <w:rPr>
+                <w:b/>
+                <w:color w:val="0F172A"/>
+                <w:sz w:val="18"/>
+              </w:rPr>
+              <w:t>Quadrant 2 (Stars ER)</w:t>
+            </w:r>
+          </w:p>
+        </w:tc>
+        <w:tc>
+          <w:tcPr>
+            <w:tcW w:type="dxa" w:w="4896"/>
+            <w:tcMar>
+              <w:top w:w="80" w:type="dxa"/>
+              <w:bottom w:w="80" w:type="dxa"/>
+              <w:left w:w="100" w:type="dxa"/>
+              <w:right w:w="100" w:type="dxa"/>
+            </w:tcMar>
+          </w:tcPr>
+          <w:p>
+            <w:r>
+              <w:rPr>
+                <w:color w:val="1E293B"/>
+                <w:sz w:val="19"/>
+              </w:rPr>
+              <w:t>Le Quadrant 2 (jaune, haut à droite) isole les 'Stars d'Engagement' (&gt; 1M abonnés &amp; &gt; 15 % ER). Recommandation : leur allouer 20 % du budget pour sécuriser des temps forts de campagne.</w:t>
+            </w:r>
+          </w:p>
+        </w:tc>
+      </w:tr>
+      <w:tr>
+        <w:tc>
+          <w:tcPr>
+            <w:tcW w:type="dxa" w:w="4896"/>
+            <w:shd w:fill="F8FAFC"/>
+            <w:tcMar>
+              <w:top w:w="80" w:type="dxa"/>
+              <w:bottom w:w="80" w:type="dxa"/>
+              <w:left w:w="100" w:type="dxa"/>
+              <w:right w:w="100" w:type="dxa"/>
+            </w:tcMar>
+          </w:tcPr>
+          <w:p>
+            <w:r>
+              <w:rPr>
+                <w:b/>
+                <w:color w:val="0F172A"/>
+                <w:sz w:val="18"/>
+              </w:rPr>
+              <w:t>Quadrant 3 (Masse)</w:t>
+            </w:r>
+          </w:p>
+        </w:tc>
+        <w:tc>
+          <w:tcPr>
+            <w:tcW w:type="dxa" w:w="4896"/>
+            <w:tcMar>
+              <w:top w:w="80" w:type="dxa"/>
+              <w:bottom w:w="80" w:type="dxa"/>
+              <w:left w:w="100" w:type="dxa"/>
+              <w:right w:w="100" w:type="dxa"/>
+            </w:tcMar>
+          </w:tcPr>
+          <w:p>
+            <w:r>
+              <w:rPr>
+                <w:color w:val="1E293B"/>
+                <w:sz w:val="19"/>
+              </w:rPr>
+              <w:t>Le Quadrant 3 (bleu, bas à droite) regroupe la 'Notoriété de Masse' (Mega stars &gt; 5M abonnés). Portée brute massive mais engagement plus faible. Recommandation : plafonner à 30 % du budget pour limiter la vulnérabilité.</w:t>
+            </w:r>
+          </w:p>
+        </w:tc>
+      </w:tr>
+      <w:tr>
+        <w:tc>
+          <w:tcPr>
+            <w:tcW w:type="dxa" w:w="4896"/>
+            <w:shd w:fill="F8FAFC"/>
+            <w:tcMar>
+              <w:top w:w="80" w:type="dxa"/>
+              <w:bottom w:w="80" w:type="dxa"/>
+              <w:left w:w="100" w:type="dxa"/>
+              <w:right w:w="100" w:type="dxa"/>
+            </w:tcMar>
+          </w:tcPr>
+          <w:p>
+            <w:r>
+              <w:rPr>
+                <w:b/>
+                <w:color w:val="0F172A"/>
+                <w:sz w:val="18"/>
+              </w:rPr>
+              <w:t>Quadrant 4 (Test)</w:t>
+            </w:r>
+          </w:p>
+        </w:tc>
+        <w:tc>
+          <w:tcPr>
+            <w:tcW w:type="dxa" w:w="4896"/>
+            <w:tcMar>
+              <w:top w:w="80" w:type="dxa"/>
+              <w:bottom w:w="80" w:type="dxa"/>
+              <w:left w:w="100" w:type="dxa"/>
+              <w:right w:w="100" w:type="dxa"/>
+            </w:tcMar>
+          </w:tcPr>
+          <w:p>
+            <w:r>
+              <w:rPr>
+                <w:color w:val="1E293B"/>
+                <w:sz w:val="19"/>
+              </w:rPr>
+              <w:t>Le Quadrant 4 (gris, bas à gauche) sert d'enveloppe de test &amp; learn avec de faibles dotations.</w:t>
+            </w:r>
+          </w:p>
+        </w:tc>
+      </w:tr>
+    </w:tbl>
+    <w:p/>
+    <w:p>
+      <w:pPr>
+        <w:pStyle w:val="Heading2"/>
+      </w:pPr>
+      <w:r>
+        <w:rPr>
+          <w:color w:val="1E3A8A"/>
+          <w:sz w:val="22"/>
+        </w:rPr>
+        <w:t>MINUTE 4 (2:45 - 3:30) | ONGLET 4 : DEEP DIVE &amp; FACTORS</w:t>
       </w:r>
     </w:p>
     <w:p>
@@ -810,7 +1074,7 @@
           <w:color w:val="1E3A8A"/>
           <w:sz w:val="22"/>
         </w:rPr>
-        <w:t>MINUTE 4 (3:15 - 4:15) | ONGLET 5 : CAMPAIGN SIMULATOR &amp; ROI</w:t>
+        <w:t>MINUTE 5 (3:30 - 4:30) | ONGLET 5 : CAMPAIGN SIMULATOR &amp; ROI</w:t>
       </w:r>
     </w:p>
     <w:p>
@@ -1030,7 +1294,7 @@
           <w:color w:val="1E3A8A"/>
           <w:sz w:val="22"/>
         </w:rPr>
-        <w:t>MINUTE 5 (4:15 - 5:00) | ONGLET 6 : CLEAN DATA &amp; CONCLUSION</w:t>
+        <w:t>CONCLUSION (4:30 - 5:00) | ONGLET 6 : CLEAN DATA &amp; CONCLUSION</w:t>
       </w:r>
     </w:p>
     <w:p>

</xml_diff>